<commit_message>
Refactor Lib V2 Prepare to change CTable
</commit_message>
<xml_diff>
--- a/Experts/Anhnt/Document/MQL5 Note/2026 0908 Trailling.docx
+++ b/Experts/Anhnt/Document/MQL5 Note/2026 0908 Trailling.docx
@@ -78,6 +78,613 @@
         <w:t xml:space="preserve">     └─ CTrailingBySAR : CTrailingByInd    → chỉ khác ở chỗ lấy handle từ iSAR(), GetStopLossValue() thừa kế nguyên</w:t>
       </w:r>
     </w:p>
+    <w:p/>
+    <w:tbl>
+      <w:tblPr>
+        <w:tblW w:w="0" w:type="auto"/>
+        <w:tblBorders>
+          <w:top w:val="single" w:sz="4" w:space="0" w:color="auto"/>
+          <w:left w:val="single" w:sz="4" w:space="0" w:color="auto"/>
+          <w:bottom w:val="single" w:sz="4" w:space="0" w:color="auto"/>
+          <w:right w:val="single" w:sz="4" w:space="0" w:color="auto"/>
+        </w:tblBorders>
+        <w:shd w:val="clear" w:color="auto" w:fill="F3F3F3"/>
+        <w:tblLayout w:type="fixed"/>
+        <w:tblCellMar>
+          <w:top w:w="15" w:type="dxa"/>
+          <w:left w:w="15" w:type="dxa"/>
+          <w:bottom w:w="15" w:type="dxa"/>
+          <w:right w:w="15" w:type="dxa"/>
+        </w:tblCellMar>
+        <w:tblLook w:val="04A0" w:firstRow="1" w:lastRow="0" w:firstColumn="1" w:lastColumn="0" w:noHBand="0" w:noVBand="1"/>
+      </w:tblPr>
+      <w:tblGrid>
+        <w:gridCol w:w="1838"/>
+        <w:gridCol w:w="1276"/>
+        <w:gridCol w:w="1417"/>
+        <w:gridCol w:w="4819"/>
+      </w:tblGrid>
+      <w:tr>
+        <w:trPr>
+          <w:tblHeader/>
+        </w:trPr>
+        <w:tc>
+          <w:tcPr>
+            <w:tcW w:w="1838" w:type="dxa"/>
+            <w:tcBorders>
+              <w:top w:val="single" w:sz="4" w:space="0" w:color="auto"/>
+              <w:left w:val="single" w:sz="4" w:space="0" w:color="auto"/>
+              <w:bottom w:val="single" w:sz="4" w:space="0" w:color="auto"/>
+              <w:right w:val="single" w:sz="4" w:space="0" w:color="auto"/>
+            </w:tcBorders>
+            <w:shd w:val="clear" w:color="auto" w:fill="F3F3F3"/>
+            <w:tcMar>
+              <w:top w:w="30" w:type="dxa"/>
+              <w:left w:w="30" w:type="dxa"/>
+              <w:bottom w:w="30" w:type="dxa"/>
+              <w:right w:w="30" w:type="dxa"/>
+            </w:tcMar>
+            <w:vAlign w:val="center"/>
+            <w:hideMark/>
+          </w:tcPr>
+          <w:p>
+            <w:pPr>
+              <w:rPr>
+                <w:b/>
+                <w:bCs/>
+              </w:rPr>
+            </w:pPr>
+            <w:r>
+              <w:rPr>
+                <w:b/>
+                <w:bCs/>
+              </w:rPr>
+              <w:t>Tình huống</w:t>
+            </w:r>
+          </w:p>
+        </w:tc>
+        <w:tc>
+          <w:tcPr>
+            <w:tcW w:w="1276" w:type="dxa"/>
+            <w:tcBorders>
+              <w:top w:val="single" w:sz="4" w:space="0" w:color="auto"/>
+              <w:left w:val="single" w:sz="4" w:space="0" w:color="auto"/>
+              <w:bottom w:val="single" w:sz="4" w:space="0" w:color="auto"/>
+              <w:right w:val="single" w:sz="4" w:space="0" w:color="auto"/>
+            </w:tcBorders>
+            <w:shd w:val="clear" w:color="auto" w:fill="F3F3F3"/>
+            <w:tcMar>
+              <w:top w:w="30" w:type="dxa"/>
+              <w:left w:w="30" w:type="dxa"/>
+              <w:bottom w:w="30" w:type="dxa"/>
+              <w:right w:w="30" w:type="dxa"/>
+            </w:tcMar>
+            <w:vAlign w:val="center"/>
+            <w:hideMark/>
+          </w:tcPr>
+          <w:p>
+            <w:pPr>
+              <w:rPr>
+                <w:b/>
+                <w:bCs/>
+              </w:rPr>
+            </w:pPr>
+            <w:r>
+              <w:rPr>
+                <w:b/>
+                <w:bCs/>
+              </w:rPr>
+              <w:t>sl_active</w:t>
+            </w:r>
+          </w:p>
+        </w:tc>
+        <w:tc>
+          <w:tcPr>
+            <w:tcW w:w="1417" w:type="dxa"/>
+            <w:tcBorders>
+              <w:top w:val="single" w:sz="4" w:space="0" w:color="auto"/>
+              <w:left w:val="single" w:sz="4" w:space="0" w:color="auto"/>
+              <w:bottom w:val="single" w:sz="4" w:space="0" w:color="auto"/>
+              <w:right w:val="single" w:sz="4" w:space="0" w:color="auto"/>
+            </w:tcBorders>
+            <w:shd w:val="clear" w:color="auto" w:fill="F3F3F3"/>
+            <w:tcMar>
+              <w:top w:w="30" w:type="dxa"/>
+              <w:left w:w="30" w:type="dxa"/>
+              <w:bottom w:w="30" w:type="dxa"/>
+              <w:right w:w="30" w:type="dxa"/>
+            </w:tcMar>
+            <w:vAlign w:val="center"/>
+            <w:hideMark/>
+          </w:tcPr>
+          <w:p>
+            <w:pPr>
+              <w:rPr>
+                <w:b/>
+                <w:bCs/>
+              </w:rPr>
+            </w:pPr>
+            <w:r>
+              <w:rPr>
+                <w:b/>
+                <w:bCs/>
+              </w:rPr>
+              <w:t>trail_active</w:t>
+            </w:r>
+          </w:p>
+        </w:tc>
+        <w:tc>
+          <w:tcPr>
+            <w:tcW w:w="4819" w:type="dxa"/>
+            <w:tcBorders>
+              <w:top w:val="single" w:sz="4" w:space="0" w:color="auto"/>
+              <w:left w:val="single" w:sz="4" w:space="0" w:color="auto"/>
+              <w:bottom w:val="single" w:sz="4" w:space="0" w:color="auto"/>
+              <w:right w:val="single" w:sz="4" w:space="0" w:color="auto"/>
+            </w:tcBorders>
+            <w:shd w:val="clear" w:color="auto" w:fill="F3F3F3"/>
+            <w:tcMar>
+              <w:top w:w="30" w:type="dxa"/>
+              <w:left w:w="30" w:type="dxa"/>
+              <w:bottom w:w="30" w:type="dxa"/>
+              <w:right w:w="30" w:type="dxa"/>
+            </w:tcMar>
+            <w:vAlign w:val="center"/>
+            <w:hideMark/>
+          </w:tcPr>
+          <w:p>
+            <w:pPr>
+              <w:rPr>
+                <w:b/>
+                <w:bCs/>
+              </w:rPr>
+            </w:pPr>
+            <w:r>
+              <w:rPr>
+                <w:b/>
+                <w:bCs/>
+              </w:rPr>
+              <w:t>Hành động</w:t>
+            </w:r>
+          </w:p>
+        </w:tc>
+      </w:tr>
+      <w:tr>
+        <w:tc>
+          <w:tcPr>
+            <w:tcW w:w="1838" w:type="dxa"/>
+            <w:tcBorders>
+              <w:top w:val="single" w:sz="4" w:space="0" w:color="auto"/>
+              <w:left w:val="single" w:sz="4" w:space="0" w:color="auto"/>
+              <w:bottom w:val="single" w:sz="4" w:space="0" w:color="auto"/>
+              <w:right w:val="single" w:sz="4" w:space="0" w:color="auto"/>
+            </w:tcBorders>
+            <w:shd w:val="clear" w:color="auto" w:fill="F3F3F3"/>
+            <w:tcMar>
+              <w:top w:w="30" w:type="dxa"/>
+              <w:left w:w="30" w:type="dxa"/>
+              <w:bottom w:w="30" w:type="dxa"/>
+              <w:right w:w="30" w:type="dxa"/>
+            </w:tcMar>
+            <w:vAlign w:val="center"/>
+            <w:hideMark/>
+          </w:tcPr>
+          <w:p>
+            <w:r>
+              <w:t>Lệnh mới (SL = 0)</w:t>
+            </w:r>
+          </w:p>
+        </w:tc>
+        <w:tc>
+          <w:tcPr>
+            <w:tcW w:w="1276" w:type="dxa"/>
+            <w:tcBorders>
+              <w:top w:val="single" w:sz="4" w:space="0" w:color="auto"/>
+              <w:left w:val="single" w:sz="4" w:space="0" w:color="auto"/>
+              <w:bottom w:val="single" w:sz="4" w:space="0" w:color="auto"/>
+              <w:right w:val="single" w:sz="4" w:space="0" w:color="auto"/>
+            </w:tcBorders>
+            <w:shd w:val="clear" w:color="auto" w:fill="F3F3F3"/>
+            <w:tcMar>
+              <w:top w:w="30" w:type="dxa"/>
+              <w:left w:w="30" w:type="dxa"/>
+              <w:bottom w:w="30" w:type="dxa"/>
+              <w:right w:w="30" w:type="dxa"/>
+            </w:tcMar>
+            <w:vAlign w:val="center"/>
+            <w:hideMark/>
+          </w:tcPr>
+          <w:p>
+            <w:r>
+              <w:t>true</w:t>
+            </w:r>
+          </w:p>
+        </w:tc>
+        <w:tc>
+          <w:tcPr>
+            <w:tcW w:w="1417" w:type="dxa"/>
+            <w:tcBorders>
+              <w:top w:val="single" w:sz="4" w:space="0" w:color="auto"/>
+              <w:left w:val="single" w:sz="4" w:space="0" w:color="auto"/>
+              <w:bottom w:val="single" w:sz="4" w:space="0" w:color="auto"/>
+              <w:right w:val="single" w:sz="4" w:space="0" w:color="auto"/>
+            </w:tcBorders>
+            <w:shd w:val="clear" w:color="auto" w:fill="F3F3F3"/>
+            <w:tcMar>
+              <w:top w:w="30" w:type="dxa"/>
+              <w:left w:w="30" w:type="dxa"/>
+              <w:bottom w:w="30" w:type="dxa"/>
+              <w:right w:w="30" w:type="dxa"/>
+            </w:tcMar>
+            <w:vAlign w:val="center"/>
+            <w:hideMark/>
+          </w:tcPr>
+          <w:p>
+            <w:r>
+              <w:t>true</w:t>
+            </w:r>
+          </w:p>
+        </w:tc>
+        <w:tc>
+          <w:tcPr>
+            <w:tcW w:w="4819" w:type="dxa"/>
+            <w:tcBorders>
+              <w:top w:val="single" w:sz="4" w:space="0" w:color="auto"/>
+              <w:left w:val="single" w:sz="4" w:space="0" w:color="auto"/>
+              <w:bottom w:val="single" w:sz="4" w:space="0" w:color="auto"/>
+              <w:right w:val="single" w:sz="4" w:space="0" w:color="auto"/>
+            </w:tcBorders>
+            <w:shd w:val="clear" w:color="auto" w:fill="F3F3F3"/>
+            <w:tcMar>
+              <w:top w:w="30" w:type="dxa"/>
+              <w:left w:w="30" w:type="dxa"/>
+              <w:bottom w:w="30" w:type="dxa"/>
+              <w:right w:w="30" w:type="dxa"/>
+            </w:tcMar>
+            <w:vAlign w:val="center"/>
+            <w:hideMark/>
+          </w:tcPr>
+          <w:p>
+            <w:r>
+              <w:t>Á</w:t>
+            </w:r>
+            <w:r>
+              <w:t>p StopLost một lần (bootstrap)</w:t>
+            </w:r>
+            <w:r>
+              <w:t>, trailing compare mức StopLost mới theo stoplost setting và Trailling Setting và dịch mức Stoplost</w:t>
+            </w:r>
+          </w:p>
+        </w:tc>
+      </w:tr>
+      <w:tr>
+        <w:tc>
+          <w:tcPr>
+            <w:tcW w:w="1838" w:type="dxa"/>
+            <w:tcBorders>
+              <w:top w:val="single" w:sz="4" w:space="0" w:color="auto"/>
+              <w:left w:val="single" w:sz="4" w:space="0" w:color="auto"/>
+              <w:bottom w:val="single" w:sz="4" w:space="0" w:color="auto"/>
+              <w:right w:val="single" w:sz="4" w:space="0" w:color="auto"/>
+            </w:tcBorders>
+            <w:shd w:val="clear" w:color="auto" w:fill="F3F3F3"/>
+            <w:tcMar>
+              <w:top w:w="30" w:type="dxa"/>
+              <w:left w:w="30" w:type="dxa"/>
+              <w:bottom w:w="30" w:type="dxa"/>
+              <w:right w:w="30" w:type="dxa"/>
+            </w:tcMar>
+            <w:vAlign w:val="center"/>
+            <w:hideMark/>
+          </w:tcPr>
+          <w:p>
+            <w:r>
+              <w:t>Lệnh mới (SL = 0)</w:t>
+            </w:r>
+          </w:p>
+        </w:tc>
+        <w:tc>
+          <w:tcPr>
+            <w:tcW w:w="1276" w:type="dxa"/>
+            <w:tcBorders>
+              <w:top w:val="single" w:sz="4" w:space="0" w:color="auto"/>
+              <w:left w:val="single" w:sz="4" w:space="0" w:color="auto"/>
+              <w:bottom w:val="single" w:sz="4" w:space="0" w:color="auto"/>
+              <w:right w:val="single" w:sz="4" w:space="0" w:color="auto"/>
+            </w:tcBorders>
+            <w:shd w:val="clear" w:color="auto" w:fill="F3F3F3"/>
+            <w:tcMar>
+              <w:top w:w="30" w:type="dxa"/>
+              <w:left w:w="30" w:type="dxa"/>
+              <w:bottom w:w="30" w:type="dxa"/>
+              <w:right w:w="30" w:type="dxa"/>
+            </w:tcMar>
+            <w:vAlign w:val="center"/>
+            <w:hideMark/>
+          </w:tcPr>
+          <w:p>
+            <w:r>
+              <w:t>false</w:t>
+            </w:r>
+          </w:p>
+        </w:tc>
+        <w:tc>
+          <w:tcPr>
+            <w:tcW w:w="1417" w:type="dxa"/>
+            <w:tcBorders>
+              <w:top w:val="single" w:sz="4" w:space="0" w:color="auto"/>
+              <w:left w:val="single" w:sz="4" w:space="0" w:color="auto"/>
+              <w:bottom w:val="single" w:sz="4" w:space="0" w:color="auto"/>
+              <w:right w:val="single" w:sz="4" w:space="0" w:color="auto"/>
+            </w:tcBorders>
+            <w:shd w:val="clear" w:color="auto" w:fill="F3F3F3"/>
+            <w:tcMar>
+              <w:top w:w="30" w:type="dxa"/>
+              <w:left w:w="30" w:type="dxa"/>
+              <w:bottom w:w="30" w:type="dxa"/>
+              <w:right w:w="30" w:type="dxa"/>
+            </w:tcMar>
+            <w:vAlign w:val="center"/>
+            <w:hideMark/>
+          </w:tcPr>
+          <w:p>
+            <w:r>
+              <w:t>true</w:t>
+            </w:r>
+          </w:p>
+        </w:tc>
+        <w:tc>
+          <w:tcPr>
+            <w:tcW w:w="4819" w:type="dxa"/>
+            <w:tcBorders>
+              <w:top w:val="single" w:sz="4" w:space="0" w:color="auto"/>
+              <w:left w:val="single" w:sz="4" w:space="0" w:color="auto"/>
+              <w:bottom w:val="single" w:sz="4" w:space="0" w:color="auto"/>
+              <w:right w:val="single" w:sz="4" w:space="0" w:color="auto"/>
+            </w:tcBorders>
+            <w:shd w:val="clear" w:color="auto" w:fill="F3F3F3"/>
+            <w:tcMar>
+              <w:top w:w="30" w:type="dxa"/>
+              <w:left w:w="30" w:type="dxa"/>
+              <w:bottom w:w="30" w:type="dxa"/>
+              <w:right w:w="30" w:type="dxa"/>
+            </w:tcMar>
+            <w:vAlign w:val="center"/>
+            <w:hideMark/>
+          </w:tcPr>
+          <w:p>
+            <w:r>
+              <w:rPr>
+                <w:b/>
+                <w:bCs/>
+              </w:rPr>
+              <w:t>không</w:t>
+            </w:r>
+            <w:r>
+              <w:t> đặt SL</w:t>
+            </w:r>
+            <w:r>
+              <w:t xml:space="preserve"> còn vẫn t</w:t>
+            </w:r>
+            <w:r>
+              <w:t>ính StopLost mới theo mức so sánh và dịch StopLost</w:t>
+            </w:r>
+          </w:p>
+        </w:tc>
+      </w:tr>
+      <w:tr>
+        <w:tc>
+          <w:tcPr>
+            <w:tcW w:w="1838" w:type="dxa"/>
+            <w:tcBorders>
+              <w:top w:val="single" w:sz="4" w:space="0" w:color="auto"/>
+              <w:left w:val="single" w:sz="4" w:space="0" w:color="auto"/>
+              <w:bottom w:val="single" w:sz="4" w:space="0" w:color="auto"/>
+              <w:right w:val="single" w:sz="4" w:space="0" w:color="auto"/>
+            </w:tcBorders>
+            <w:shd w:val="clear" w:color="auto" w:fill="F3F3F3"/>
+            <w:tcMar>
+              <w:top w:w="30" w:type="dxa"/>
+              <w:left w:w="30" w:type="dxa"/>
+              <w:bottom w:w="30" w:type="dxa"/>
+              <w:right w:w="30" w:type="dxa"/>
+            </w:tcMar>
+            <w:vAlign w:val="center"/>
+            <w:hideMark/>
+          </w:tcPr>
+          <w:p>
+            <w:r>
+              <w:t>Lệnh cũ (đã có SL)</w:t>
+            </w:r>
+          </w:p>
+        </w:tc>
+        <w:tc>
+          <w:tcPr>
+            <w:tcW w:w="1276" w:type="dxa"/>
+            <w:tcBorders>
+              <w:top w:val="single" w:sz="4" w:space="0" w:color="auto"/>
+              <w:left w:val="single" w:sz="4" w:space="0" w:color="auto"/>
+              <w:bottom w:val="single" w:sz="4" w:space="0" w:color="auto"/>
+              <w:right w:val="single" w:sz="4" w:space="0" w:color="auto"/>
+            </w:tcBorders>
+            <w:shd w:val="clear" w:color="auto" w:fill="F3F3F3"/>
+            <w:tcMar>
+              <w:top w:w="30" w:type="dxa"/>
+              <w:left w:w="30" w:type="dxa"/>
+              <w:bottom w:w="30" w:type="dxa"/>
+              <w:right w:w="30" w:type="dxa"/>
+            </w:tcMar>
+            <w:vAlign w:val="center"/>
+            <w:hideMark/>
+          </w:tcPr>
+          <w:p>
+            <w:r>
+              <w:t>true</w:t>
+            </w:r>
+          </w:p>
+        </w:tc>
+        <w:tc>
+          <w:tcPr>
+            <w:tcW w:w="1417" w:type="dxa"/>
+            <w:tcBorders>
+              <w:top w:val="single" w:sz="4" w:space="0" w:color="auto"/>
+              <w:left w:val="single" w:sz="4" w:space="0" w:color="auto"/>
+              <w:bottom w:val="single" w:sz="4" w:space="0" w:color="auto"/>
+              <w:right w:val="single" w:sz="4" w:space="0" w:color="auto"/>
+            </w:tcBorders>
+            <w:shd w:val="clear" w:color="auto" w:fill="F3F3F3"/>
+            <w:tcMar>
+              <w:top w:w="30" w:type="dxa"/>
+              <w:left w:w="30" w:type="dxa"/>
+              <w:bottom w:w="30" w:type="dxa"/>
+              <w:right w:w="30" w:type="dxa"/>
+            </w:tcMar>
+            <w:vAlign w:val="center"/>
+            <w:hideMark/>
+          </w:tcPr>
+          <w:p>
+            <w:r>
+              <w:t>false</w:t>
+            </w:r>
+          </w:p>
+        </w:tc>
+        <w:tc>
+          <w:tcPr>
+            <w:tcW w:w="4819" w:type="dxa"/>
+            <w:tcBorders>
+              <w:top w:val="single" w:sz="4" w:space="0" w:color="auto"/>
+              <w:left w:val="single" w:sz="4" w:space="0" w:color="auto"/>
+              <w:bottom w:val="single" w:sz="4" w:space="0" w:color="auto"/>
+              <w:right w:val="single" w:sz="4" w:space="0" w:color="auto"/>
+            </w:tcBorders>
+            <w:shd w:val="clear" w:color="auto" w:fill="F3F3F3"/>
+            <w:tcMar>
+              <w:top w:w="30" w:type="dxa"/>
+              <w:left w:w="30" w:type="dxa"/>
+              <w:bottom w:w="30" w:type="dxa"/>
+              <w:right w:w="30" w:type="dxa"/>
+            </w:tcMar>
+            <w:vAlign w:val="center"/>
+            <w:hideMark/>
+          </w:tcPr>
+          <w:p>
+            <w:r>
+              <w:t>Sẽ áp mức Stoplost cho lệnh mới theo StopLost Setting và không dịch</w:t>
+            </w:r>
+          </w:p>
+        </w:tc>
+      </w:tr>
+      <w:tr>
+        <w:tc>
+          <w:tcPr>
+            <w:tcW w:w="1838" w:type="dxa"/>
+            <w:tcBorders>
+              <w:top w:val="single" w:sz="4" w:space="0" w:color="auto"/>
+              <w:left w:val="single" w:sz="4" w:space="0" w:color="auto"/>
+              <w:bottom w:val="single" w:sz="4" w:space="0" w:color="auto"/>
+              <w:right w:val="single" w:sz="4" w:space="0" w:color="auto"/>
+            </w:tcBorders>
+            <w:shd w:val="clear" w:color="auto" w:fill="F3F3F3"/>
+            <w:tcMar>
+              <w:top w:w="30" w:type="dxa"/>
+              <w:left w:w="30" w:type="dxa"/>
+              <w:bottom w:w="30" w:type="dxa"/>
+              <w:right w:w="30" w:type="dxa"/>
+            </w:tcMar>
+            <w:vAlign w:val="center"/>
+            <w:hideMark/>
+          </w:tcPr>
+          <w:p>
+            <w:r>
+              <w:t>Lệnh cũ</w:t>
+            </w:r>
+          </w:p>
+        </w:tc>
+        <w:tc>
+          <w:tcPr>
+            <w:tcW w:w="1276" w:type="dxa"/>
+            <w:tcBorders>
+              <w:top w:val="single" w:sz="4" w:space="0" w:color="auto"/>
+              <w:left w:val="single" w:sz="4" w:space="0" w:color="auto"/>
+              <w:bottom w:val="single" w:sz="4" w:space="0" w:color="auto"/>
+              <w:right w:val="single" w:sz="4" w:space="0" w:color="auto"/>
+            </w:tcBorders>
+            <w:shd w:val="clear" w:color="auto" w:fill="F3F3F3"/>
+            <w:tcMar>
+              <w:top w:w="30" w:type="dxa"/>
+              <w:left w:w="30" w:type="dxa"/>
+              <w:bottom w:w="30" w:type="dxa"/>
+              <w:right w:w="30" w:type="dxa"/>
+            </w:tcMar>
+            <w:vAlign w:val="center"/>
+            <w:hideMark/>
+          </w:tcPr>
+          <w:p>
+            <w:r>
+              <w:t>false</w:t>
+            </w:r>
+          </w:p>
+        </w:tc>
+        <w:tc>
+          <w:tcPr>
+            <w:tcW w:w="1417" w:type="dxa"/>
+            <w:tcBorders>
+              <w:top w:val="single" w:sz="4" w:space="0" w:color="auto"/>
+              <w:left w:val="single" w:sz="4" w:space="0" w:color="auto"/>
+              <w:bottom w:val="single" w:sz="4" w:space="0" w:color="auto"/>
+              <w:right w:val="single" w:sz="4" w:space="0" w:color="auto"/>
+            </w:tcBorders>
+            <w:shd w:val="clear" w:color="auto" w:fill="F3F3F3"/>
+            <w:tcMar>
+              <w:top w:w="30" w:type="dxa"/>
+              <w:left w:w="30" w:type="dxa"/>
+              <w:bottom w:w="30" w:type="dxa"/>
+              <w:right w:w="30" w:type="dxa"/>
+            </w:tcMar>
+            <w:vAlign w:val="center"/>
+            <w:hideMark/>
+          </w:tcPr>
+          <w:p>
+            <w:r>
+              <w:t>false</w:t>
+            </w:r>
+          </w:p>
+        </w:tc>
+        <w:tc>
+          <w:tcPr>
+            <w:tcW w:w="4819" w:type="dxa"/>
+            <w:tcBorders>
+              <w:top w:val="single" w:sz="4" w:space="0" w:color="auto"/>
+              <w:left w:val="single" w:sz="4" w:space="0" w:color="auto"/>
+              <w:bottom w:val="single" w:sz="4" w:space="0" w:color="auto"/>
+              <w:right w:val="single" w:sz="4" w:space="0" w:color="auto"/>
+            </w:tcBorders>
+            <w:shd w:val="clear" w:color="auto" w:fill="F3F3F3"/>
+            <w:tcMar>
+              <w:top w:w="30" w:type="dxa"/>
+              <w:left w:w="30" w:type="dxa"/>
+              <w:bottom w:w="30" w:type="dxa"/>
+              <w:right w:w="30" w:type="dxa"/>
+            </w:tcMar>
+            <w:vAlign w:val="center"/>
+            <w:hideMark/>
+          </w:tcPr>
+          <w:p>
+            <w:r>
+              <w:rPr>
+                <w:b/>
+                <w:bCs/>
+              </w:rPr>
+              <w:t>Chả làm gì cả.</w:t>
+            </w:r>
+            <w:r>
+              <w:br/>
+            </w:r>
+          </w:p>
+        </w:tc>
+      </w:tr>
+    </w:tbl>
+    <w:p/>
     <w:p/>
     <w:sectPr>
       <w:pgSz w:w="12240" w:h="15840"/>
@@ -693,7 +1300,6 @@
   <w:style w:type="character" w:default="1" w:styleId="DefaultParagraphFont">
     <w:name w:val="Default Paragraph Font"/>
     <w:uiPriority w:val="1"/>
-    <w:semiHidden/>
     <w:unhideWhenUsed/>
   </w:style>
   <w:style w:type="table" w:default="1" w:styleId="TableNormal">

</xml_diff>